<commit_message>
Update LinkedIn profile URL in hero social links; refresh resume binary
</commit_message>
<xml_diff>
--- a/RESUME.docx
+++ b/RESUME.docx
@@ -4,333 +4,686 @@
   <w:body>
     <w:p>
       <w:pPr>
-        <w:rPr>
-          <w:b/>
-          <w:bCs/>
-          <w:sz w:val="48"/>
-          <w:szCs w:val="48"/>
-        </w:rPr>
-      </w:pPr>
-      <w:r>
-        <w:rPr>
-          <w:b/>
-          <w:bCs/>
-          <w:sz w:val="48"/>
-          <w:szCs w:val="48"/>
+        <w:jc w:val="center"/>
+        <w:rPr>
+          <w:b/>
+          <w:bCs/>
+          <w:sz w:val="44"/>
+          <w:szCs w:val="44"/>
+          <w:u w:val="single"/>
+        </w:rPr>
+      </w:pPr>
+      <w:r>
+        <w:rPr>
+          <w:b/>
+          <w:bCs/>
+          <w:sz w:val="44"/>
+          <w:szCs w:val="44"/>
+          <w:u w:val="single"/>
+        </w:rPr>
+        <w:t>Curriculum Vitae (C</w:t>
+      </w:r>
+      <w:r>
+        <w:rPr>
+          <w:b/>
+          <w:bCs/>
+          <w:sz w:val="44"/>
+          <w:szCs w:val="44"/>
+          <w:u w:val="single"/>
+        </w:rPr>
+        <w:t>V)</w:t>
+      </w:r>
+    </w:p>
+    <w:p>
+      <w:pPr>
+        <w:jc w:val="center"/>
+        <w:rPr>
+          <w:b/>
+          <w:bCs/>
+          <w:sz w:val="44"/>
+          <w:szCs w:val="44"/>
+          <w:u w:val="single"/>
+        </w:rPr>
+      </w:pPr>
+    </w:p>
+    <w:p>
+      <w:pPr>
+        <w:rPr>
+          <w:sz w:val="28"/>
+          <w:szCs w:val="28"/>
+        </w:rPr>
+      </w:pPr>
+      <w:r>
+        <w:rPr>
+          <w:b/>
+          <w:bCs/>
+          <w:sz w:val="28"/>
+          <w:szCs w:val="28"/>
         </w:rPr>
         <w:t>Adabala Venkata Thrinadh</w:t>
       </w:r>
     </w:p>
     <w:p>
-      <w:r>
-        <w:rPr>
-          <w:rFonts w:ascii="Segoe UI Emoji" w:hAnsi="Segoe UI Emoji" w:cs="Segoe UI Emoji"/>
-        </w:rPr>
-        <w:t>📍</w:t>
-      </w:r>
-      <w:r>
-        <w:t xml:space="preserve"> Rajahmundry, Andhra Pradesh</w:t>
-      </w:r>
-      <w:r>
-        <w:br/>
-      </w:r>
-      <w:r>
-        <w:rPr>
-          <w:rFonts w:ascii="Segoe UI Emoji" w:hAnsi="Segoe UI Emoji" w:cs="Segoe UI Emoji"/>
-        </w:rPr>
-        <w:t>📧</w:t>
-      </w:r>
-      <w:r>
-        <w:t xml:space="preserve"> thrinadh2005@gmail.com</w:t>
-      </w:r>
-    </w:p>
-    <w:p>
-      <w:r>
-        <w:pict w14:anchorId="6B8EA856">
-          <v:rect id="_x0000_i1203" style="width:0;height:1.5pt" o:hralign="center" o:hrstd="t" o:hr="t" fillcolor="#a0a0a0" stroked="f"/>
-        </w:pict>
-      </w:r>
-    </w:p>
-    <w:p>
-      <w:pPr>
-        <w:rPr>
-          <w:b/>
-          <w:bCs/>
-        </w:rPr>
-      </w:pPr>
-      <w:r>
-        <w:rPr>
-          <w:b/>
-          <w:bCs/>
-        </w:rPr>
-        <w:t>Profile Summary</w:t>
-      </w:r>
-    </w:p>
-    <w:p>
-      <w:r>
-        <w:t xml:space="preserve">Computer Science student and cybersecurity enthusiast with strong expertise in secure coding practices and ethical hacking methodologies. Skilled at building robust applications while </w:t>
+      <w:pPr>
+        <w:rPr>
+          <w:sz w:val="28"/>
+          <w:szCs w:val="28"/>
+        </w:rPr>
+      </w:pPr>
+      <w:r>
+        <w:rPr>
+          <w:sz w:val="28"/>
+          <w:szCs w:val="28"/>
+        </w:rPr>
+        <w:t>Rajahmundry, Andhra Pradesh, India</w:t>
+      </w:r>
+    </w:p>
+    <w:p>
+      <w:pPr>
+        <w:rPr>
+          <w:sz w:val="28"/>
+          <w:szCs w:val="28"/>
+        </w:rPr>
+      </w:pPr>
+      <w:r>
+        <w:rPr>
+          <w:sz w:val="28"/>
+          <w:szCs w:val="28"/>
+        </w:rPr>
+        <w:t xml:space="preserve">Email: </w:t>
+      </w:r>
+      <w:hyperlink r:id="rId7" w:history="1">
+        <w:r>
+          <w:rPr>
+            <w:rStyle w:val="Hyperlink"/>
+            <w:sz w:val="28"/>
+            <w:szCs w:val="28"/>
+          </w:rPr>
+          <w:t>thrinadh2005@gmail.com</w:t>
+        </w:r>
+      </w:hyperlink>
+    </w:p>
+    <w:p>
+      <w:pPr>
+        <w:rPr>
+          <w:sz w:val="28"/>
+          <w:szCs w:val="28"/>
+        </w:rPr>
+      </w:pPr>
+      <w:r>
+        <w:rPr>
+          <w:sz w:val="28"/>
+          <w:szCs w:val="28"/>
+        </w:rPr>
+        <w:t xml:space="preserve">Portfolio: </w:t>
+      </w:r>
+      <w:hyperlink r:id="rId8" w:history="1">
+        <w:r>
+          <w:rPr>
+            <w:rStyle w:val="Hyperlink"/>
+            <w:sz w:val="28"/>
+            <w:szCs w:val="28"/>
+          </w:rPr>
+          <w:t>https://thrinadh.vercel.app</w:t>
+        </w:r>
+      </w:hyperlink>
+    </w:p>
+    <w:p>
+      <w:pPr>
+        <w:rPr>
+          <w:b/>
+          <w:bCs/>
+          <w:sz w:val="32"/>
+          <w:szCs w:val="32"/>
+        </w:rPr>
+      </w:pPr>
+      <w:r>
+        <w:rPr>
+          <w:b/>
+          <w:bCs/>
+          <w:sz w:val="32"/>
+          <w:szCs w:val="32"/>
+        </w:rPr>
+        <w:t>Profile</w:t>
+      </w:r>
+    </w:p>
+    <w:p>
+      <w:pPr>
+        <w:rPr>
+          <w:sz w:val="28"/>
+          <w:szCs w:val="28"/>
+        </w:rPr>
+      </w:pPr>
+      <w:r>
+        <w:rPr>
+          <w:sz w:val="28"/>
+          <w:szCs w:val="28"/>
+        </w:rPr>
+        <w:t xml:space="preserve">Second-year </w:t>
+      </w:r>
+      <w:hyperlink r:id="rId9" w:history="1">
+        <w:proofErr w:type="spellStart"/>
+        <w:r>
+          <w:rPr>
+            <w:rStyle w:val="Hyperlink"/>
+            <w:sz w:val="28"/>
+            <w:szCs w:val="28"/>
+          </w:rPr>
+          <w:t>B.Tech</w:t>
+        </w:r>
+        <w:proofErr w:type="spellEnd"/>
+      </w:hyperlink>
+      <w:r>
+        <w:rPr>
+          <w:sz w:val="28"/>
+          <w:szCs w:val="28"/>
+        </w:rPr>
+        <w:t xml:space="preserve"> Computer Science and Engineering student with a strong interest in cybersecurity and secure software development. Interested in building reliable applications and learning practical security concepts.</w:t>
+      </w:r>
+    </w:p>
+    <w:p>
+      <w:pPr>
+        <w:rPr>
+          <w:b/>
+          <w:bCs/>
+          <w:sz w:val="36"/>
+          <w:szCs w:val="36"/>
+        </w:rPr>
+      </w:pPr>
+      <w:r>
+        <w:rPr>
+          <w:b/>
+          <w:bCs/>
+          <w:sz w:val="36"/>
+          <w:szCs w:val="36"/>
+        </w:rPr>
+        <w:t>Education</w:t>
+      </w:r>
+    </w:p>
+    <w:p>
+      <w:pPr>
+        <w:rPr>
+          <w:b/>
+          <w:bCs/>
+          <w:sz w:val="28"/>
+          <w:szCs w:val="28"/>
+        </w:rPr>
+      </w:pPr>
+      <w:hyperlink r:id="rId10" w:history="1">
+        <w:proofErr w:type="spellStart"/>
+        <w:proofErr w:type="gramStart"/>
+        <w:r>
+          <w:rPr>
+            <w:rStyle w:val="Hyperlink"/>
+            <w:b/>
+            <w:bCs/>
+            <w:sz w:val="28"/>
+            <w:szCs w:val="28"/>
+          </w:rPr>
+          <w:t>B.Tech</w:t>
+        </w:r>
+        <w:proofErr w:type="spellEnd"/>
+        <w:proofErr w:type="gramEnd"/>
+      </w:hyperlink>
+      <w:r>
+        <w:rPr>
+          <w:b/>
+          <w:bCs/>
+          <w:sz w:val="28"/>
+          <w:szCs w:val="28"/>
+        </w:rPr>
+        <w:t xml:space="preserve"> (Computer Science and Engineering)</w:t>
+      </w:r>
+      <w:r>
+        <w:rPr>
+          <w:b/>
+          <w:bCs/>
+          <w:sz w:val="28"/>
+          <w:szCs w:val="28"/>
+        </w:rPr>
+        <w:t xml:space="preserve"> </w:t>
+      </w:r>
+    </w:p>
+    <w:p>
+      <w:pPr>
+        <w:rPr>
+          <w:sz w:val="28"/>
+          <w:szCs w:val="28"/>
+        </w:rPr>
+      </w:pPr>
+      <w:r>
+        <w:rPr>
+          <w:sz w:val="28"/>
+          <w:szCs w:val="28"/>
+        </w:rPr>
+        <w:t xml:space="preserve">GMR Institute of Technology (GMRIT), </w:t>
       </w:r>
       <w:proofErr w:type="spellStart"/>
       <w:r>
-        <w:t>analyzing</w:t>
+        <w:rPr>
+          <w:sz w:val="28"/>
+          <w:szCs w:val="28"/>
+        </w:rPr>
+        <w:t>Rajam</w:t>
       </w:r>
       <w:proofErr w:type="spellEnd"/>
-      <w:r>
-        <w:t xml:space="preserve"> vulnerabilities from both developer and attacker perspectives. Passionate about problem-solving, hackathons, and bridging the gap between theoretical computer science and modern development.</w:t>
-      </w:r>
-    </w:p>
-    <w:p>
-      <w:r>
-        <w:pict w14:anchorId="5ADCCA7A">
-          <v:rect id="_x0000_i1204" style="width:0;height:1.5pt" o:hralign="center" o:hrstd="t" o:hr="t" fillcolor="#a0a0a0" stroked="f"/>
-        </w:pict>
-      </w:r>
-    </w:p>
-    <w:p>
-      <w:pPr>
-        <w:rPr>
-          <w:b/>
-          <w:bCs/>
-        </w:rPr>
-      </w:pPr>
-      <w:r>
-        <w:rPr>
-          <w:b/>
-          <w:bCs/>
-        </w:rPr>
-        <w:t>Education</w:t>
+    </w:p>
+    <w:p>
+      <w:pPr>
+        <w:rPr>
+          <w:sz w:val="28"/>
+          <w:szCs w:val="28"/>
+        </w:rPr>
+      </w:pPr>
+      <w:r>
+        <w:rPr>
+          <w:sz w:val="28"/>
+          <w:szCs w:val="28"/>
+        </w:rPr>
+        <w:t>2024 – 2028 (2nd year; student since 2024)</w:t>
+      </w:r>
+    </w:p>
+    <w:p>
+      <w:pPr>
+        <w:rPr>
+          <w:sz w:val="28"/>
+          <w:szCs w:val="28"/>
+        </w:rPr>
+      </w:pPr>
+      <w:r>
+        <w:rPr>
+          <w:sz w:val="28"/>
+          <w:szCs w:val="28"/>
+        </w:rPr>
+        <w:t>Roll No: 24341A0502</w:t>
+      </w:r>
+    </w:p>
+    <w:p>
+      <w:pPr>
+        <w:rPr>
+          <w:sz w:val="28"/>
+          <w:szCs w:val="28"/>
+        </w:rPr>
+      </w:pPr>
+      <w:r>
+        <w:rPr>
+          <w:sz w:val="28"/>
+          <w:szCs w:val="28"/>
+        </w:rPr>
+        <w:t>CGPA: 9.</w:t>
+      </w:r>
+      <w:r>
+        <w:rPr>
+          <w:sz w:val="28"/>
+          <w:szCs w:val="28"/>
+        </w:rPr>
+        <w:t>33</w:t>
+      </w:r>
+      <w:r>
+        <w:rPr>
+          <w:sz w:val="28"/>
+          <w:szCs w:val="28"/>
+        </w:rPr>
+        <w:t xml:space="preserve"> / 10 (as of now)</w:t>
+      </w:r>
+    </w:p>
+    <w:p>
+      <w:pPr>
+        <w:rPr>
+          <w:sz w:val="28"/>
+          <w:szCs w:val="28"/>
+        </w:rPr>
+      </w:pPr>
+      <w:r>
+        <w:rPr>
+          <w:b/>
+          <w:bCs/>
+          <w:sz w:val="28"/>
+          <w:szCs w:val="28"/>
+        </w:rPr>
+        <w:t>Intermediate (Class XII)</w:t>
+      </w:r>
+      <w:r>
+        <w:rPr>
+          <w:sz w:val="28"/>
+          <w:szCs w:val="28"/>
+        </w:rPr>
+        <w:t xml:space="preserve"> </w:t>
+      </w:r>
+    </w:p>
+    <w:p>
+      <w:pPr>
+        <w:rPr>
+          <w:sz w:val="28"/>
+          <w:szCs w:val="28"/>
+        </w:rPr>
+      </w:pPr>
+      <w:r>
+        <w:rPr>
+          <w:sz w:val="28"/>
+          <w:szCs w:val="28"/>
+        </w:rPr>
+        <w:t xml:space="preserve">Tirumala Junior </w:t>
+      </w:r>
+      <w:proofErr w:type="spellStart"/>
+      <w:r>
+        <w:rPr>
+          <w:sz w:val="28"/>
+          <w:szCs w:val="28"/>
+        </w:rPr>
+        <w:t>Kalasala</w:t>
+      </w:r>
+      <w:proofErr w:type="spellEnd"/>
+      <w:r>
+        <w:rPr>
+          <w:sz w:val="28"/>
+          <w:szCs w:val="28"/>
+        </w:rPr>
+        <w:t>, AP Board</w:t>
+      </w:r>
+      <w:r>
+        <w:rPr>
+          <w:sz w:val="28"/>
+          <w:szCs w:val="28"/>
+        </w:rPr>
+        <w:t xml:space="preserve"> </w:t>
+      </w:r>
+      <w:r>
+        <w:rPr>
+          <w:sz w:val="28"/>
+          <w:szCs w:val="28"/>
+        </w:rPr>
+        <w:t>2024</w:t>
+      </w:r>
+      <w:r>
+        <w:rPr>
+          <w:sz w:val="28"/>
+          <w:szCs w:val="28"/>
+        </w:rPr>
+        <w:t>(BIEAP)</w:t>
+      </w:r>
+    </w:p>
+    <w:p>
+      <w:pPr>
+        <w:rPr>
+          <w:sz w:val="28"/>
+          <w:szCs w:val="28"/>
+        </w:rPr>
+      </w:pPr>
+      <w:r>
+        <w:rPr>
+          <w:sz w:val="28"/>
+          <w:szCs w:val="28"/>
+        </w:rPr>
+        <w:t xml:space="preserve"> Percentage:</w:t>
+      </w:r>
+      <w:r>
+        <w:rPr>
+          <w:sz w:val="28"/>
+          <w:szCs w:val="28"/>
+        </w:rPr>
+        <w:t xml:space="preserve"> 9</w:t>
+      </w:r>
+      <w:r>
+        <w:rPr>
+          <w:sz w:val="28"/>
+          <w:szCs w:val="28"/>
+        </w:rPr>
+        <w:t>7.6</w:t>
+      </w:r>
+      <w:r>
+        <w:rPr>
+          <w:sz w:val="28"/>
+          <w:szCs w:val="28"/>
+        </w:rPr>
+        <w:t xml:space="preserve"> </w:t>
+      </w:r>
+      <w:r>
+        <w:rPr>
+          <w:sz w:val="28"/>
+          <w:szCs w:val="28"/>
+        </w:rPr>
+        <w:t>%</w:t>
+      </w:r>
+    </w:p>
+    <w:p>
+      <w:pPr>
+        <w:rPr>
+          <w:b/>
+          <w:bCs/>
+          <w:sz w:val="28"/>
+          <w:szCs w:val="28"/>
+        </w:rPr>
+      </w:pPr>
+      <w:r>
+        <w:rPr>
+          <w:b/>
+          <w:bCs/>
+          <w:sz w:val="28"/>
+          <w:szCs w:val="28"/>
+        </w:rPr>
+        <w:t>Secondary School (Class X)</w:t>
+      </w:r>
+    </w:p>
+    <w:p>
+      <w:pPr>
+        <w:rPr>
+          <w:sz w:val="28"/>
+          <w:szCs w:val="28"/>
+        </w:rPr>
+      </w:pPr>
+      <w:r>
+        <w:rPr>
+          <w:sz w:val="28"/>
+          <w:szCs w:val="28"/>
+        </w:rPr>
+        <w:t xml:space="preserve">Sri Shirdi Sai Vidya </w:t>
+      </w:r>
+      <w:r>
+        <w:rPr>
+          <w:sz w:val="28"/>
+          <w:szCs w:val="28"/>
+        </w:rPr>
+        <w:t>Niketan, SSC board AP (2022)</w:t>
+      </w:r>
+    </w:p>
+    <w:p>
+      <w:pPr>
+        <w:rPr>
+          <w:sz w:val="28"/>
+          <w:szCs w:val="28"/>
+        </w:rPr>
+      </w:pPr>
+      <w:r>
+        <w:rPr>
+          <w:sz w:val="28"/>
+          <w:szCs w:val="28"/>
+        </w:rPr>
+        <w:t>Score: 92.3</w:t>
+      </w:r>
+      <w:r>
+        <w:rPr>
+          <w:sz w:val="28"/>
+          <w:szCs w:val="28"/>
+        </w:rPr>
+        <w:t xml:space="preserve"> </w:t>
+      </w:r>
+      <w:r>
+        <w:rPr>
+          <w:sz w:val="28"/>
+          <w:szCs w:val="28"/>
+        </w:rPr>
+        <w:t>%</w:t>
+      </w:r>
+    </w:p>
+    <w:p>
+      <w:pPr>
+        <w:rPr>
+          <w:b/>
+          <w:bCs/>
+          <w:sz w:val="36"/>
+          <w:szCs w:val="36"/>
+        </w:rPr>
+      </w:pPr>
+      <w:r>
+        <w:rPr>
+          <w:b/>
+          <w:bCs/>
+          <w:sz w:val="36"/>
+          <w:szCs w:val="36"/>
+        </w:rPr>
+        <w:t>Skills</w:t>
       </w:r>
     </w:p>
     <w:p>
       <w:pPr>
         <w:numPr>
           <w:ilvl w:val="0"/>
-          <w:numId w:val="7"/>
+          <w:numId w:val="13"/>
         </w:numPr>
-      </w:pPr>
-      <w:proofErr w:type="spellStart"/>
-      <w:proofErr w:type="gramStart"/>
-      <w:r>
-        <w:rPr>
-          <w:b/>
-          <w:bCs/>
-        </w:rPr>
-        <w:t>B.Tech</w:t>
-      </w:r>
-      <w:proofErr w:type="spellEnd"/>
-      <w:proofErr w:type="gramEnd"/>
-      <w:r>
-        <w:rPr>
-          <w:b/>
-          <w:bCs/>
-        </w:rPr>
-        <w:t xml:space="preserve"> in Computer Science &amp; Engineering</w:t>
-      </w:r>
-      <w:r>
-        <w:br/>
-        <w:t xml:space="preserve">GMR Institute of Technology (GMRIT), </w:t>
-      </w:r>
-      <w:proofErr w:type="spellStart"/>
-      <w:r>
-        <w:t>Rajam</w:t>
-      </w:r>
-      <w:proofErr w:type="spellEnd"/>
-      <w:r>
-        <w:br/>
-      </w:r>
-      <w:r>
-        <w:rPr>
-          <w:i/>
-          <w:iCs/>
-        </w:rPr>
-        <w:t>2024 – 2028 | CGPA: 9.4 / 10</w:t>
-      </w:r>
-      <w:r>
-        <w:rPr>
-          <w:i/>
-          <w:iCs/>
-        </w:rPr>
-        <w:t>(as of now)</w:t>
+        <w:rPr>
+          <w:sz w:val="28"/>
+          <w:szCs w:val="28"/>
+        </w:rPr>
+      </w:pPr>
+      <w:r>
+        <w:rPr>
+          <w:sz w:val="28"/>
+          <w:szCs w:val="28"/>
+        </w:rPr>
+        <w:t>Programming: Python, Java, C</w:t>
       </w:r>
     </w:p>
     <w:p>
       <w:pPr>
         <w:numPr>
           <w:ilvl w:val="0"/>
-          <w:numId w:val="7"/>
+          <w:numId w:val="13"/>
         </w:numPr>
-      </w:pPr>
-      <w:r>
-        <w:rPr>
-          <w:b/>
-          <w:bCs/>
-        </w:rPr>
-        <w:t>Intermediate (Class XII)</w:t>
-      </w:r>
-      <w:r>
-        <w:br/>
-        <w:t xml:space="preserve">Tirumala Junior </w:t>
-      </w:r>
-      <w:proofErr w:type="spellStart"/>
-      <w:r>
-        <w:t>Kalasala</w:t>
-      </w:r>
-      <w:proofErr w:type="spellEnd"/>
-      <w:r>
-        <w:t>, AP Board</w:t>
-      </w:r>
-      <w:r>
-        <w:br/>
-      </w:r>
-      <w:r>
-        <w:rPr>
-          <w:i/>
-          <w:iCs/>
-        </w:rPr>
-        <w:t>2024 | GPA: 9.76 / 10</w:t>
+        <w:rPr>
+          <w:sz w:val="28"/>
+          <w:szCs w:val="28"/>
+        </w:rPr>
+      </w:pPr>
+      <w:r>
+        <w:rPr>
+          <w:sz w:val="28"/>
+          <w:szCs w:val="28"/>
+        </w:rPr>
+        <w:t>Core CS: Data Structures, Algorithms, OOP, Operating Systems</w:t>
       </w:r>
     </w:p>
     <w:p>
       <w:pPr>
         <w:numPr>
           <w:ilvl w:val="0"/>
-          <w:numId w:val="7"/>
+          <w:numId w:val="13"/>
         </w:numPr>
-      </w:pPr>
-      <w:r>
-        <w:rPr>
-          <w:b/>
-          <w:bCs/>
-        </w:rPr>
-        <w:t>Secondary School (Class X)</w:t>
-      </w:r>
-      <w:r>
-        <w:br/>
-        <w:t>Sri Shirdi Sai Vidya Niketan</w:t>
-      </w:r>
-      <w:r>
-        <w:br/>
-      </w:r>
-      <w:r>
-        <w:rPr>
-          <w:i/>
-          <w:iCs/>
-        </w:rPr>
-        <w:t>2022 | Score: 92.3%</w:t>
-      </w:r>
-    </w:p>
-    <w:p>
-      <w:r>
-        <w:pict w14:anchorId="63507F10">
-          <v:rect id="_x0000_i1205" style="width:0;height:1.5pt" o:hralign="center" o:hrstd="t" o:hr="t" fillcolor="#a0a0a0" stroked="f"/>
-        </w:pict>
-      </w:r>
-    </w:p>
-    <w:p>
-      <w:pPr>
-        <w:rPr>
-          <w:b/>
-          <w:bCs/>
-        </w:rPr>
-      </w:pPr>
-      <w:r>
-        <w:rPr>
-          <w:b/>
-          <w:bCs/>
-        </w:rPr>
-        <w:t>Skills</w:t>
+        <w:rPr>
+          <w:sz w:val="28"/>
+          <w:szCs w:val="28"/>
+        </w:rPr>
+      </w:pPr>
+      <w:r>
+        <w:rPr>
+          <w:sz w:val="28"/>
+          <w:szCs w:val="28"/>
+        </w:rPr>
+        <w:t>Databases: DBMS, SQL</w:t>
       </w:r>
     </w:p>
     <w:p>
       <w:pPr>
         <w:numPr>
           <w:ilvl w:val="0"/>
-          <w:numId w:val="8"/>
+          <w:numId w:val="13"/>
         </w:numPr>
-      </w:pPr>
-      <w:r>
-        <w:rPr>
-          <w:b/>
-          <w:bCs/>
-        </w:rPr>
-        <w:t>Programming:</w:t>
-      </w:r>
-      <w:r>
-        <w:t xml:space="preserve"> Python, Java, C++/C</w:t>
+        <w:rPr>
+          <w:sz w:val="28"/>
+          <w:szCs w:val="28"/>
+        </w:rPr>
+      </w:pPr>
+      <w:r>
+        <w:rPr>
+          <w:sz w:val="28"/>
+          <w:szCs w:val="28"/>
+        </w:rPr>
+        <w:lastRenderedPageBreak/>
+        <w:t>Tools: Git, GitHub</w:t>
       </w:r>
     </w:p>
     <w:p>
       <w:pPr>
         <w:numPr>
           <w:ilvl w:val="0"/>
-          <w:numId w:val="8"/>
+          <w:numId w:val="13"/>
         </w:numPr>
-      </w:pPr>
-      <w:r>
-        <w:rPr>
-          <w:b/>
-          <w:bCs/>
-        </w:rPr>
-        <w:t>Core CS Concepts:</w:t>
-      </w:r>
-      <w:r>
-        <w:t xml:space="preserve"> Data Structures, Algorithms, DBMS &amp; SQL, OOPs, Operating Systems, Computer Networks</w:t>
+        <w:rPr>
+          <w:sz w:val="28"/>
+          <w:szCs w:val="28"/>
+        </w:rPr>
+      </w:pPr>
+      <w:r>
+        <w:rPr>
+          <w:sz w:val="28"/>
+          <w:szCs w:val="28"/>
+        </w:rPr>
+        <w:t>Web: HTML, CSS, JavaScript (fundamentals)</w:t>
       </w:r>
     </w:p>
     <w:p>
       <w:pPr>
         <w:numPr>
           <w:ilvl w:val="0"/>
-          <w:numId w:val="8"/>
+          <w:numId w:val="13"/>
         </w:numPr>
-      </w:pPr>
-      <w:r>
-        <w:rPr>
-          <w:b/>
-          <w:bCs/>
-        </w:rPr>
-        <w:t>Tools &amp; Platforms:</w:t>
-      </w:r>
-      <w:r>
-        <w:t xml:space="preserve"> Git, GitHub, Web Technologies</w:t>
+        <w:rPr>
+          <w:sz w:val="28"/>
+          <w:szCs w:val="28"/>
+        </w:rPr>
+      </w:pPr>
+      <w:r>
+        <w:rPr>
+          <w:sz w:val="28"/>
+          <w:szCs w:val="28"/>
+        </w:rPr>
+        <w:t>Security: Cybersecurity fundamentals, secure coding awareness</w:t>
       </w:r>
     </w:p>
     <w:p>
       <w:pPr>
         <w:numPr>
           <w:ilvl w:val="0"/>
-          <w:numId w:val="8"/>
+          <w:numId w:val="13"/>
         </w:numPr>
-      </w:pPr>
-      <w:r>
-        <w:rPr>
-          <w:b/>
-          <w:bCs/>
-        </w:rPr>
-        <w:t>Specializations:</w:t>
-      </w:r>
-      <w:r>
-        <w:t xml:space="preserve"> Problem Solving, Cyber Security, Secure Coding Practices</w:t>
-      </w:r>
-    </w:p>
-    <w:p>
-      <w:r>
-        <w:pict w14:anchorId="2227735D">
-          <v:rect id="_x0000_i1206" style="width:0;height:1.5pt" o:hralign="center" o:hrstd="t" o:hr="t" fillcolor="#a0a0a0" stroked="f"/>
-        </w:pict>
-      </w:r>
-    </w:p>
-    <w:p>
-      <w:pPr>
-        <w:rPr>
-          <w:b/>
-          <w:bCs/>
-        </w:rPr>
-      </w:pPr>
-      <w:r>
-        <w:rPr>
-          <w:b/>
-          <w:bCs/>
+        <w:rPr>
+          <w:sz w:val="28"/>
+          <w:szCs w:val="28"/>
+        </w:rPr>
+      </w:pPr>
+      <w:r>
+        <w:rPr>
+          <w:sz w:val="28"/>
+          <w:szCs w:val="28"/>
+        </w:rPr>
+        <w:t>Strengths: Problem solving</w:t>
+      </w:r>
+    </w:p>
+    <w:p>
+      <w:pPr>
+        <w:rPr>
+          <w:b/>
+          <w:bCs/>
+          <w:sz w:val="32"/>
+          <w:szCs w:val="32"/>
+        </w:rPr>
+      </w:pPr>
+      <w:r>
+        <w:rPr>
+          <w:b/>
+          <w:bCs/>
+          <w:sz w:val="32"/>
+          <w:szCs w:val="32"/>
         </w:rPr>
         <w:t>Certifications</w:t>
       </w:r>
@@ -339,477 +692,1106 @@
       <w:pPr>
         <w:numPr>
           <w:ilvl w:val="0"/>
-          <w:numId w:val="9"/>
+          <w:numId w:val="14"/>
         </w:numPr>
-      </w:pPr>
-      <w:r>
-        <w:t xml:space="preserve">Infosys Springboard – </w:t>
-      </w:r>
-      <w:r>
-        <w:rPr>
-          <w:i/>
-          <w:iCs/>
-        </w:rPr>
-        <w:t>Introduction to Cyber Security, Cybersecurity Fundamentals, Basics of Python</w:t>
+        <w:rPr>
+          <w:sz w:val="28"/>
+          <w:szCs w:val="28"/>
+        </w:rPr>
+      </w:pPr>
+      <w:r>
+        <w:rPr>
+          <w:b/>
+          <w:bCs/>
+          <w:sz w:val="28"/>
+          <w:szCs w:val="28"/>
+        </w:rPr>
+        <w:t>Infosys Springboard</w:t>
+      </w:r>
+      <w:r>
+        <w:rPr>
+          <w:sz w:val="28"/>
+          <w:szCs w:val="28"/>
+        </w:rPr>
+        <w:t xml:space="preserve"> </w:t>
+      </w:r>
+    </w:p>
+    <w:p>
+      <w:pPr>
+        <w:numPr>
+          <w:ilvl w:val="1"/>
+          <w:numId w:val="14"/>
+        </w:numPr>
+        <w:rPr>
+          <w:sz w:val="28"/>
+          <w:szCs w:val="28"/>
+        </w:rPr>
+      </w:pPr>
+      <w:r>
+        <w:rPr>
+          <w:sz w:val="28"/>
+          <w:szCs w:val="28"/>
+        </w:rPr>
+        <w:t>Introduction to Cyber Security</w:t>
+      </w:r>
+    </w:p>
+    <w:p>
+      <w:pPr>
+        <w:numPr>
+          <w:ilvl w:val="1"/>
+          <w:numId w:val="14"/>
+        </w:numPr>
+        <w:rPr>
+          <w:sz w:val="28"/>
+          <w:szCs w:val="28"/>
+        </w:rPr>
+      </w:pPr>
+      <w:r>
+        <w:rPr>
+          <w:sz w:val="28"/>
+          <w:szCs w:val="28"/>
+        </w:rPr>
+        <w:t>Cybersecurity Fundamentals</w:t>
+      </w:r>
+    </w:p>
+    <w:p>
+      <w:pPr>
+        <w:numPr>
+          <w:ilvl w:val="1"/>
+          <w:numId w:val="14"/>
+        </w:numPr>
+        <w:rPr>
+          <w:sz w:val="28"/>
+          <w:szCs w:val="28"/>
+        </w:rPr>
+      </w:pPr>
+      <w:r>
+        <w:rPr>
+          <w:sz w:val="28"/>
+          <w:szCs w:val="28"/>
+        </w:rPr>
+        <w:t>Basics of Python</w:t>
       </w:r>
     </w:p>
     <w:p>
       <w:pPr>
         <w:numPr>
           <w:ilvl w:val="0"/>
-          <w:numId w:val="9"/>
+          <w:numId w:val="14"/>
         </w:numPr>
-      </w:pPr>
-      <w:r>
+        <w:rPr>
+          <w:sz w:val="28"/>
+          <w:szCs w:val="28"/>
+        </w:rPr>
+      </w:pPr>
+      <w:r>
+        <w:rPr>
+          <w:b/>
+          <w:bCs/>
+          <w:sz w:val="28"/>
+          <w:szCs w:val="28"/>
+        </w:rPr>
         <w:t xml:space="preserve">L&amp;T </w:t>
       </w:r>
       <w:proofErr w:type="spellStart"/>
       <w:r>
+        <w:rPr>
+          <w:b/>
+          <w:bCs/>
+          <w:sz w:val="28"/>
+          <w:szCs w:val="28"/>
+        </w:rPr>
         <w:t>LearnConnect</w:t>
       </w:r>
       <w:proofErr w:type="spellEnd"/>
       <w:r>
-        <w:t xml:space="preserve"> – </w:t>
-      </w:r>
-      <w:r>
-        <w:rPr>
-          <w:i/>
-          <w:iCs/>
-        </w:rPr>
-        <w:t>Python Challenge Series, Web Development Fundamentals, Ethical Hacking Gateway</w:t>
+        <w:rPr>
+          <w:sz w:val="28"/>
+          <w:szCs w:val="28"/>
+        </w:rPr>
+        <w:t xml:space="preserve"> </w:t>
+      </w:r>
+    </w:p>
+    <w:p>
+      <w:pPr>
+        <w:numPr>
+          <w:ilvl w:val="1"/>
+          <w:numId w:val="14"/>
+        </w:numPr>
+        <w:rPr>
+          <w:sz w:val="28"/>
+          <w:szCs w:val="28"/>
+        </w:rPr>
+      </w:pPr>
+      <w:r>
+        <w:rPr>
+          <w:sz w:val="28"/>
+          <w:szCs w:val="28"/>
+        </w:rPr>
+        <w:t>Python Challenge Series</w:t>
+      </w:r>
+    </w:p>
+    <w:p>
+      <w:pPr>
+        <w:numPr>
+          <w:ilvl w:val="1"/>
+          <w:numId w:val="14"/>
+        </w:numPr>
+        <w:rPr>
+          <w:sz w:val="28"/>
+          <w:szCs w:val="28"/>
+        </w:rPr>
+      </w:pPr>
+      <w:r>
+        <w:rPr>
+          <w:sz w:val="28"/>
+          <w:szCs w:val="28"/>
+        </w:rPr>
+        <w:t>Web Development Fundamentals</w:t>
+      </w:r>
+    </w:p>
+    <w:p>
+      <w:pPr>
+        <w:numPr>
+          <w:ilvl w:val="1"/>
+          <w:numId w:val="14"/>
+        </w:numPr>
+        <w:rPr>
+          <w:sz w:val="28"/>
+          <w:szCs w:val="28"/>
+        </w:rPr>
+      </w:pPr>
+      <w:r>
+        <w:rPr>
+          <w:sz w:val="28"/>
+          <w:szCs w:val="28"/>
+        </w:rPr>
+        <w:t>Ethical Hacking Gateway</w:t>
       </w:r>
     </w:p>
     <w:p>
       <w:pPr>
         <w:numPr>
           <w:ilvl w:val="0"/>
-          <w:numId w:val="9"/>
+          <w:numId w:val="14"/>
         </w:numPr>
-      </w:pPr>
-      <w:r>
-        <w:t xml:space="preserve">NPTEL – </w:t>
-      </w:r>
-      <w:r>
-        <w:rPr>
-          <w:i/>
-          <w:iCs/>
-        </w:rPr>
-        <w:t>Operating System Fundamentals</w:t>
+        <w:rPr>
+          <w:sz w:val="28"/>
+          <w:szCs w:val="28"/>
+        </w:rPr>
+      </w:pPr>
+      <w:r>
+        <w:rPr>
+          <w:b/>
+          <w:bCs/>
+          <w:sz w:val="28"/>
+          <w:szCs w:val="28"/>
+        </w:rPr>
+        <w:t>NPTEL &amp; Others</w:t>
+      </w:r>
+      <w:r>
+        <w:rPr>
+          <w:sz w:val="28"/>
+          <w:szCs w:val="28"/>
+        </w:rPr>
+        <w:t xml:space="preserve"> </w:t>
       </w:r>
     </w:p>
     <w:p>
       <w:pPr>
         <w:numPr>
-          <w:ilvl w:val="0"/>
-          <w:numId w:val="9"/>
+          <w:ilvl w:val="1"/>
+          <w:numId w:val="14"/>
         </w:numPr>
-      </w:pPr>
+        <w:rPr>
+          <w:sz w:val="28"/>
+          <w:szCs w:val="28"/>
+        </w:rPr>
+      </w:pPr>
+      <w:r>
+        <w:rPr>
+          <w:sz w:val="28"/>
+          <w:szCs w:val="28"/>
+        </w:rPr>
+        <w:t>Operating System Fundamentals (NPTEL)</w:t>
+      </w:r>
+    </w:p>
+    <w:p>
+      <w:pPr>
+        <w:numPr>
+          <w:ilvl w:val="1"/>
+          <w:numId w:val="14"/>
+        </w:numPr>
+        <w:rPr>
+          <w:sz w:val="28"/>
+          <w:szCs w:val="28"/>
+        </w:rPr>
+      </w:pPr>
+      <w:r>
+        <w:rPr>
+          <w:sz w:val="28"/>
+          <w:szCs w:val="28"/>
+        </w:rPr>
+        <w:t>Problem Solving (</w:t>
+      </w:r>
       <w:proofErr w:type="spellStart"/>
       <w:r>
+        <w:rPr>
+          <w:sz w:val="28"/>
+          <w:szCs w:val="28"/>
+        </w:rPr>
         <w:t>HackerRank</w:t>
       </w:r>
       <w:proofErr w:type="spellEnd"/>
       <w:r>
-        <w:t xml:space="preserve"> – </w:t>
-      </w:r>
-      <w:r>
-        <w:rPr>
-          <w:i/>
-          <w:iCs/>
-        </w:rPr>
-        <w:t>Problem Solving, Java, Python, CSS</w:t>
-      </w:r>
-    </w:p>
-    <w:p>
-      <w:r>
+        <w:rPr>
+          <w:sz w:val="28"/>
+          <w:szCs w:val="28"/>
+        </w:rPr>
+        <w:t>)</w:t>
+      </w:r>
+    </w:p>
+    <w:p>
+      <w:pPr>
+        <w:numPr>
+          <w:ilvl w:val="1"/>
+          <w:numId w:val="14"/>
+        </w:numPr>
+        <w:rPr>
+          <w:sz w:val="28"/>
+          <w:szCs w:val="28"/>
+        </w:rPr>
+      </w:pPr>
+      <w:r>
+        <w:rPr>
+          <w:sz w:val="28"/>
+          <w:szCs w:val="28"/>
+        </w:rPr>
+        <w:t>Java / Python / CSS (</w:t>
+      </w:r>
+      <w:proofErr w:type="spellStart"/>
+      <w:r>
+        <w:rPr>
+          <w:sz w:val="28"/>
+          <w:szCs w:val="28"/>
+        </w:rPr>
+        <w:t>HackerRank</w:t>
+      </w:r>
+      <w:proofErr w:type="spellEnd"/>
+      <w:r>
+        <w:rPr>
+          <w:sz w:val="28"/>
+          <w:szCs w:val="28"/>
+        </w:rPr>
+        <w:t>)</w:t>
+      </w:r>
+    </w:p>
+    <w:p>
+      <w:pPr>
+        <w:rPr>
+          <w:b/>
+          <w:bCs/>
+          <w:sz w:val="32"/>
+          <w:szCs w:val="32"/>
+        </w:rPr>
+      </w:pPr>
+      <w:proofErr w:type="gramStart"/>
+      <w:r>
+        <w:rPr>
+          <w:b/>
+          <w:bCs/>
+          <w:sz w:val="32"/>
+          <w:szCs w:val="32"/>
+        </w:rPr>
+        <w:t>Projects</w:t>
+      </w:r>
+      <w:r>
+        <w:rPr>
+          <w:b/>
+          <w:bCs/>
+          <w:sz w:val="32"/>
+          <w:szCs w:val="32"/>
+        </w:rPr>
+        <w:t xml:space="preserve"> :</w:t>
+      </w:r>
+      <w:proofErr w:type="gramEnd"/>
+      <w:r>
+        <w:rPr>
+          <w:b/>
+          <w:bCs/>
+          <w:sz w:val="32"/>
+          <w:szCs w:val="32"/>
+        </w:rPr>
+        <w:t xml:space="preserve"> </w:t>
+      </w:r>
+    </w:p>
+    <w:p>
+      <w:pPr>
+        <w:rPr>
+          <w:sz w:val="32"/>
+          <w:szCs w:val="32"/>
+        </w:rPr>
+      </w:pPr>
+      <w:r>
+        <w:rPr>
+          <w:b/>
+          <w:bCs/>
+          <w:sz w:val="24"/>
+          <w:szCs w:val="24"/>
+        </w:rPr>
+        <w:t>(</w:t>
+      </w:r>
+      <w:r>
+        <w:rPr>
+          <w:sz w:val="24"/>
+          <w:szCs w:val="24"/>
+        </w:rPr>
+        <w:t xml:space="preserve">please do refer the projects section in </w:t>
+      </w:r>
+      <w:proofErr w:type="spellStart"/>
+      <w:r>
+        <w:rPr>
+          <w:sz w:val="24"/>
+          <w:szCs w:val="24"/>
+        </w:rPr>
+        <w:t>portifolio</w:t>
+      </w:r>
+      <w:proofErr w:type="spellEnd"/>
+      <w:r>
+        <w:rPr>
+          <w:sz w:val="24"/>
+          <w:szCs w:val="24"/>
+        </w:rPr>
+        <w:t xml:space="preserve"> to get the view of projects</w:t>
+      </w:r>
+      <w:r>
+        <w:rPr>
+          <w:sz w:val="32"/>
+          <w:szCs w:val="32"/>
+        </w:rPr>
+        <w:t>)</w:t>
+      </w:r>
+    </w:p>
+    <w:p>
+      <w:pPr>
+        <w:pStyle w:val="NoSpacing"/>
+        <w:rPr>
+          <w:b/>
+          <w:bCs/>
+          <w:sz w:val="28"/>
+          <w:szCs w:val="28"/>
+        </w:rPr>
+      </w:pPr>
+      <w:r>
+        <w:rPr>
+          <w:b/>
+          <w:bCs/>
+          <w:sz w:val="28"/>
+          <w:szCs w:val="28"/>
+        </w:rPr>
+        <w:t>1) Farmer Marketplace</w:t>
+      </w:r>
+    </w:p>
+    <w:p>
+      <w:pPr>
+        <w:pStyle w:val="NoSpacing"/>
+        <w:rPr>
+          <w:sz w:val="28"/>
+          <w:szCs w:val="28"/>
+        </w:rPr>
+      </w:pPr>
+      <w:r>
+        <w:rPr>
+          <w:sz w:val="28"/>
+          <w:szCs w:val="28"/>
+        </w:rPr>
+        <w:t>A full-stack platform that helps local farmers and plant buyers discover and purchase products.</w:t>
+      </w:r>
+    </w:p>
+    <w:p>
+      <w:pPr>
+        <w:pStyle w:val="NoSpacing"/>
+        <w:rPr>
+          <w:sz w:val="28"/>
+          <w:szCs w:val="28"/>
+        </w:rPr>
+      </w:pPr>
+      <w:r>
+        <w:rPr>
+          <w:b/>
+          <w:bCs/>
+          <w:sz w:val="28"/>
+          <w:szCs w:val="28"/>
+        </w:rPr>
+        <w:t xml:space="preserve">Tech stack: </w:t>
+      </w:r>
+      <w:r>
+        <w:rPr>
+          <w:sz w:val="28"/>
+          <w:szCs w:val="28"/>
+        </w:rPr>
+        <w:t>React, Node.js, MongoDB</w:t>
+      </w:r>
+    </w:p>
+    <w:p>
+      <w:pPr>
+        <w:pStyle w:val="NoSpacing"/>
+        <w:rPr>
+          <w:sz w:val="28"/>
+          <w:szCs w:val="28"/>
+        </w:rPr>
+      </w:pPr>
+      <w:r>
+        <w:rPr>
+          <w:b/>
+          <w:bCs/>
+          <w:sz w:val="28"/>
+          <w:szCs w:val="28"/>
+        </w:rPr>
+        <w:t>Highlights:</w:t>
+      </w:r>
+      <w:r>
+        <w:rPr>
+          <w:sz w:val="28"/>
+          <w:szCs w:val="28"/>
+        </w:rPr>
+        <w:t xml:space="preserve"> listing and search flow, basic marketplace workflow, backend structure</w:t>
+      </w:r>
+    </w:p>
+    <w:p>
+      <w:pPr>
+        <w:pStyle w:val="NoSpacing"/>
+        <w:rPr>
+          <w:sz w:val="28"/>
+          <w:szCs w:val="28"/>
+        </w:rPr>
+      </w:pPr>
+    </w:p>
+    <w:p>
+      <w:pPr>
+        <w:pStyle w:val="NoSpacing"/>
+        <w:rPr>
+          <w:b/>
+          <w:bCs/>
+          <w:sz w:val="28"/>
+          <w:szCs w:val="28"/>
+        </w:rPr>
+      </w:pPr>
+      <w:r>
+        <w:rPr>
+          <w:b/>
+          <w:bCs/>
+          <w:sz w:val="28"/>
+          <w:szCs w:val="28"/>
+        </w:rPr>
+        <w:t>2) Results System</w:t>
+      </w:r>
+    </w:p>
+    <w:p>
+      <w:pPr>
+        <w:pStyle w:val="NoSpacing"/>
+        <w:rPr>
+          <w:sz w:val="28"/>
+          <w:szCs w:val="28"/>
+        </w:rPr>
+      </w:pPr>
+      <w:r>
+        <w:rPr>
+          <w:sz w:val="28"/>
+          <w:szCs w:val="28"/>
+        </w:rPr>
+        <w:t>An academic management tool that calculates CGPA and generates reports.</w:t>
+      </w:r>
+    </w:p>
+    <w:p>
+      <w:pPr>
+        <w:pStyle w:val="NoSpacing"/>
+        <w:rPr>
+          <w:sz w:val="28"/>
+          <w:szCs w:val="28"/>
+        </w:rPr>
+      </w:pPr>
+      <w:r>
+        <w:rPr>
+          <w:b/>
+          <w:bCs/>
+          <w:sz w:val="28"/>
+          <w:szCs w:val="28"/>
+        </w:rPr>
+        <w:t>Tech stack:</w:t>
+      </w:r>
+      <w:r>
+        <w:rPr>
+          <w:sz w:val="28"/>
+          <w:szCs w:val="28"/>
+        </w:rPr>
+        <w:t xml:space="preserve"> Python, MySQL, Pandas</w:t>
+      </w:r>
+    </w:p>
+    <w:p>
+      <w:pPr>
+        <w:pStyle w:val="NoSpacing"/>
+        <w:rPr>
+          <w:sz w:val="28"/>
+          <w:szCs w:val="28"/>
+        </w:rPr>
+      </w:pPr>
+      <w:r>
+        <w:rPr>
+          <w:sz w:val="28"/>
+          <w:szCs w:val="28"/>
+        </w:rPr>
         <w:lastRenderedPageBreak/>
-        <w:pict w14:anchorId="5E817580">
-          <v:rect id="_x0000_i1207" style="width:0;height:1.5pt" o:hralign="center" o:hrstd="t" o:hr="t" fillcolor="#a0a0a0" stroked="f"/>
-        </w:pict>
-      </w:r>
-    </w:p>
-    <w:p>
-      <w:pPr>
-        <w:rPr>
-          <w:b/>
-          <w:bCs/>
-        </w:rPr>
-      </w:pPr>
-      <w:r>
-        <w:rPr>
-          <w:b/>
-          <w:bCs/>
-        </w:rPr>
-        <w:t>Projects</w:t>
-      </w:r>
-    </w:p>
-    <w:p>
-      <w:pPr>
-        <w:numPr>
-          <w:ilvl w:val="0"/>
-          <w:numId w:val="10"/>
-        </w:numPr>
-      </w:pPr>
-      <w:r>
-        <w:rPr>
-          <w:b/>
-          <w:bCs/>
-        </w:rPr>
-        <w:t>Farmer Marketplace</w:t>
-      </w:r>
-      <w:r>
-        <w:t xml:space="preserve"> – Full-stack platform connecting farmers and buyers with location discovery and OTP verification. </w:t>
-      </w:r>
-      <w:r>
-        <w:rPr>
-          <w:i/>
-          <w:iCs/>
-        </w:rPr>
-        <w:t>(React, Node.js, MongoDB)</w:t>
-      </w:r>
-    </w:p>
-    <w:p>
-      <w:pPr>
-        <w:numPr>
-          <w:ilvl w:val="0"/>
-          <w:numId w:val="10"/>
-        </w:numPr>
-      </w:pPr>
-      <w:r>
-        <w:rPr>
-          <w:b/>
-          <w:bCs/>
-        </w:rPr>
-        <w:t>Results System</w:t>
-      </w:r>
-      <w:r>
-        <w:t xml:space="preserve"> – Automated academic management system for CGPA calculation and real-time performance reports. </w:t>
-      </w:r>
-      <w:r>
-        <w:rPr>
-          <w:i/>
-          <w:iCs/>
-        </w:rPr>
-        <w:t>(Python, MySQL, Pandas)</w:t>
-      </w:r>
-    </w:p>
-    <w:p>
-      <w:pPr>
-        <w:numPr>
-          <w:ilvl w:val="0"/>
-          <w:numId w:val="10"/>
-        </w:numPr>
-      </w:pPr>
+        <w:t>Highlights: accurate calculations, automated report generation</w:t>
+      </w:r>
+    </w:p>
+    <w:p>
+      <w:pPr>
+        <w:pStyle w:val="NoSpacing"/>
+        <w:rPr>
+          <w:sz w:val="28"/>
+          <w:szCs w:val="28"/>
+        </w:rPr>
+      </w:pPr>
+    </w:p>
+    <w:p>
+      <w:pPr>
+        <w:pStyle w:val="NoSpacing"/>
+        <w:rPr>
+          <w:b/>
+          <w:bCs/>
+          <w:sz w:val="28"/>
+          <w:szCs w:val="28"/>
+        </w:rPr>
+      </w:pPr>
+      <w:r>
+        <w:rPr>
+          <w:b/>
+          <w:bCs/>
+          <w:sz w:val="28"/>
+          <w:szCs w:val="28"/>
+        </w:rPr>
+        <w:t xml:space="preserve">3) </w:t>
+      </w:r>
       <w:proofErr w:type="spellStart"/>
       <w:r>
         <w:rPr>
           <w:b/>
           <w:bCs/>
+          <w:sz w:val="28"/>
+          <w:szCs w:val="28"/>
         </w:rPr>
         <w:t>SecurePass</w:t>
       </w:r>
       <w:proofErr w:type="spellEnd"/>
-      <w:r>
-        <w:t xml:space="preserve"> – Security tool for password strength checking and text encryption. </w:t>
-      </w:r>
-      <w:r>
-        <w:rPr>
-          <w:i/>
-          <w:iCs/>
-        </w:rPr>
-        <w:t>(Python, Cryptography)</w:t>
-      </w:r>
-    </w:p>
-    <w:p>
-      <w:pPr>
-        <w:numPr>
-          <w:ilvl w:val="0"/>
-          <w:numId w:val="10"/>
-        </w:numPr>
-      </w:pPr>
-      <w:r>
-        <w:rPr>
-          <w:b/>
-          <w:bCs/>
-        </w:rPr>
-        <w:t>Personal Portfolio</w:t>
-      </w:r>
-      <w:r>
-        <w:t xml:space="preserve"> – Responsive, high-performance portfolio with </w:t>
+    </w:p>
+    <w:p>
+      <w:pPr>
+        <w:pStyle w:val="NoSpacing"/>
+        <w:rPr>
+          <w:sz w:val="28"/>
+          <w:szCs w:val="28"/>
+        </w:rPr>
+      </w:pPr>
+      <w:r>
+        <w:rPr>
+          <w:sz w:val="28"/>
+          <w:szCs w:val="28"/>
+        </w:rPr>
+        <w:t>A small security utility that checks password strength and encrypts text.</w:t>
+      </w:r>
+    </w:p>
+    <w:p>
+      <w:pPr>
+        <w:pStyle w:val="NoSpacing"/>
+        <w:rPr>
+          <w:sz w:val="28"/>
+          <w:szCs w:val="28"/>
+        </w:rPr>
+      </w:pPr>
+      <w:r>
+        <w:rPr>
+          <w:b/>
+          <w:bCs/>
+          <w:sz w:val="28"/>
+          <w:szCs w:val="28"/>
+        </w:rPr>
+        <w:t>Tech stack:</w:t>
+      </w:r>
+      <w:r>
+        <w:rPr>
+          <w:sz w:val="28"/>
+          <w:szCs w:val="28"/>
+        </w:rPr>
+        <w:t xml:space="preserve"> Python, Cryptography</w:t>
+      </w:r>
+    </w:p>
+    <w:p>
+      <w:pPr>
+        <w:pStyle w:val="NoSpacing"/>
+        <w:rPr>
+          <w:sz w:val="28"/>
+          <w:szCs w:val="28"/>
+        </w:rPr>
+      </w:pPr>
+      <w:r>
+        <w:rPr>
+          <w:b/>
+          <w:bCs/>
+          <w:sz w:val="28"/>
+          <w:szCs w:val="28"/>
+        </w:rPr>
+        <w:t>Highlights</w:t>
+      </w:r>
+      <w:r>
+        <w:rPr>
+          <w:sz w:val="28"/>
+          <w:szCs w:val="28"/>
+        </w:rPr>
+        <w:t>: security-focused utilities and safe handling of text</w:t>
+      </w:r>
+    </w:p>
+    <w:p>
+      <w:pPr>
+        <w:pStyle w:val="NoSpacing"/>
+        <w:rPr>
+          <w:sz w:val="28"/>
+          <w:szCs w:val="28"/>
+        </w:rPr>
+      </w:pPr>
+    </w:p>
+    <w:p>
+      <w:pPr>
+        <w:pStyle w:val="NoSpacing"/>
+        <w:rPr>
+          <w:b/>
+          <w:bCs/>
+          <w:sz w:val="28"/>
+          <w:szCs w:val="28"/>
+        </w:rPr>
+      </w:pPr>
+      <w:r>
+        <w:rPr>
+          <w:b/>
+          <w:bCs/>
+          <w:sz w:val="28"/>
+          <w:szCs w:val="28"/>
+        </w:rPr>
+        <w:t>4) Dictionary App</w:t>
+      </w:r>
+    </w:p>
+    <w:p>
+      <w:pPr>
+        <w:pStyle w:val="NoSpacing"/>
+        <w:rPr>
+          <w:sz w:val="28"/>
+          <w:szCs w:val="28"/>
+        </w:rPr>
+      </w:pPr>
+      <w:r>
+        <w:rPr>
+          <w:sz w:val="28"/>
+          <w:szCs w:val="28"/>
+        </w:rPr>
+        <w:t>A dictionary application with user authentication and a responsive interface.</w:t>
+      </w:r>
+    </w:p>
+    <w:p>
+      <w:pPr>
+        <w:pStyle w:val="NoSpacing"/>
+        <w:rPr>
+          <w:sz w:val="28"/>
+          <w:szCs w:val="28"/>
+        </w:rPr>
+      </w:pPr>
+      <w:r>
+        <w:rPr>
+          <w:b/>
+          <w:bCs/>
+          <w:sz w:val="28"/>
+          <w:szCs w:val="28"/>
+        </w:rPr>
+        <w:t>Tech stack:</w:t>
+      </w:r>
+      <w:r>
+        <w:rPr>
+          <w:sz w:val="28"/>
+          <w:szCs w:val="28"/>
+        </w:rPr>
+        <w:t xml:space="preserve"> React</w:t>
+      </w:r>
+    </w:p>
+    <w:p>
+      <w:pPr>
+        <w:pStyle w:val="NoSpacing"/>
+        <w:rPr>
+          <w:sz w:val="28"/>
+          <w:szCs w:val="28"/>
+        </w:rPr>
+      </w:pPr>
+      <w:r>
+        <w:rPr>
+          <w:b/>
+          <w:bCs/>
+          <w:sz w:val="28"/>
+          <w:szCs w:val="28"/>
+        </w:rPr>
+        <w:t>Highlights:</w:t>
+      </w:r>
+      <w:r>
+        <w:rPr>
+          <w:sz w:val="28"/>
+          <w:szCs w:val="28"/>
+        </w:rPr>
+        <w:t xml:space="preserve"> login flow and clean UI</w:t>
+      </w:r>
+    </w:p>
+    <w:p>
+      <w:pPr>
+        <w:pStyle w:val="NoSpacing"/>
+        <w:rPr>
+          <w:sz w:val="28"/>
+          <w:szCs w:val="28"/>
+        </w:rPr>
+      </w:pPr>
+    </w:p>
+    <w:p>
+      <w:pPr>
+        <w:pStyle w:val="NoSpacing"/>
+        <w:rPr>
+          <w:b/>
+          <w:bCs/>
+          <w:sz w:val="28"/>
+          <w:szCs w:val="28"/>
+        </w:rPr>
+      </w:pPr>
+      <w:r>
+        <w:rPr>
+          <w:b/>
+          <w:bCs/>
+          <w:sz w:val="28"/>
+          <w:szCs w:val="28"/>
+        </w:rPr>
+        <w:t>5) Personal Portfolio</w:t>
+      </w:r>
+    </w:p>
+    <w:p>
+      <w:pPr>
+        <w:pStyle w:val="NoSpacing"/>
+        <w:rPr>
+          <w:sz w:val="28"/>
+          <w:szCs w:val="28"/>
+        </w:rPr>
+      </w:pPr>
+      <w:r>
+        <w:rPr>
+          <w:sz w:val="28"/>
+          <w:szCs w:val="28"/>
+        </w:rPr>
+        <w:t>A personal portfolio website.</w:t>
+      </w:r>
+    </w:p>
+    <w:p>
+      <w:pPr>
+        <w:pStyle w:val="NoSpacing"/>
+        <w:rPr>
+          <w:sz w:val="28"/>
+          <w:szCs w:val="28"/>
+        </w:rPr>
+      </w:pPr>
+      <w:r>
+        <w:rPr>
+          <w:b/>
+          <w:bCs/>
+          <w:sz w:val="28"/>
+          <w:szCs w:val="28"/>
+        </w:rPr>
+        <w:t>Tech stack</w:t>
+      </w:r>
+      <w:r>
+        <w:rPr>
+          <w:sz w:val="28"/>
+          <w:szCs w:val="28"/>
+        </w:rPr>
+        <w:t>: HTML5, CSS3, JavaScript</w:t>
+      </w:r>
+    </w:p>
+    <w:p>
+      <w:pPr>
+        <w:pStyle w:val="NoSpacing"/>
+        <w:rPr>
+          <w:sz w:val="28"/>
+          <w:szCs w:val="28"/>
+        </w:rPr>
+      </w:pPr>
+      <w:r>
+        <w:rPr>
+          <w:b/>
+          <w:bCs/>
+          <w:sz w:val="28"/>
+          <w:szCs w:val="28"/>
+        </w:rPr>
+        <w:t>Link</w:t>
+      </w:r>
+      <w:r>
+        <w:rPr>
+          <w:sz w:val="28"/>
+          <w:szCs w:val="28"/>
+        </w:rPr>
+        <w:t xml:space="preserve">: </w:t>
+      </w:r>
+      <w:hyperlink r:id="rId11" w:history="1">
+        <w:r>
+          <w:rPr>
+            <w:rStyle w:val="Hyperlink"/>
+            <w:sz w:val="32"/>
+            <w:szCs w:val="32"/>
+          </w:rPr>
+          <w:t>https://thrinadh.vercel.app</w:t>
+        </w:r>
+      </w:hyperlink>
+    </w:p>
+    <w:p>
+      <w:pPr>
+        <w:pStyle w:val="NoSpacing"/>
+        <w:rPr>
+          <w:sz w:val="28"/>
+          <w:szCs w:val="28"/>
+        </w:rPr>
+      </w:pPr>
+    </w:p>
+    <w:p>
+      <w:pPr>
+        <w:rPr>
+          <w:b/>
+          <w:bCs/>
+          <w:sz w:val="28"/>
+          <w:szCs w:val="28"/>
+        </w:rPr>
+      </w:pPr>
+      <w:r>
+        <w:rPr>
+          <w:b/>
+          <w:bCs/>
+          <w:sz w:val="28"/>
+          <w:szCs w:val="28"/>
+        </w:rPr>
+        <w:t>Experience &amp; Achievements</w:t>
+      </w:r>
+    </w:p>
+    <w:p>
+      <w:pPr>
+        <w:rPr>
+          <w:b/>
+          <w:bCs/>
+          <w:sz w:val="28"/>
+          <w:szCs w:val="28"/>
+        </w:rPr>
+      </w:pPr>
+      <w:r>
+        <w:rPr>
+          <w:b/>
+          <w:bCs/>
+          <w:sz w:val="28"/>
+          <w:szCs w:val="28"/>
+        </w:rPr>
+        <w:t>1.</w:t>
+      </w:r>
+      <w:r>
+        <w:rPr>
+          <w:b/>
+          <w:bCs/>
+          <w:sz w:val="28"/>
+          <w:szCs w:val="28"/>
+        </w:rPr>
+        <w:t>Event Coordinator (STEPCONE)</w:t>
+      </w:r>
+    </w:p>
+    <w:p>
+      <w:pPr>
+        <w:rPr>
+          <w:sz w:val="28"/>
+          <w:szCs w:val="28"/>
+        </w:rPr>
+      </w:pPr>
+      <w:r>
+        <w:rPr>
+          <w:sz w:val="28"/>
+          <w:szCs w:val="28"/>
+        </w:rPr>
+        <w:t xml:space="preserve">  </w:t>
+      </w:r>
+      <w:r>
+        <w:rPr>
+          <w:sz w:val="28"/>
+          <w:szCs w:val="28"/>
+        </w:rPr>
+        <w:t>Supported planning and execution for a national-level tech fest.</w:t>
+      </w:r>
+    </w:p>
+    <w:p>
+      <w:pPr>
+        <w:rPr>
+          <w:sz w:val="28"/>
+          <w:szCs w:val="28"/>
+        </w:rPr>
+      </w:pPr>
+      <w:r>
+        <w:rPr>
+          <w:b/>
+          <w:bCs/>
+          <w:sz w:val="28"/>
+          <w:szCs w:val="28"/>
+        </w:rPr>
+        <w:t>2.</w:t>
+      </w:r>
+      <w:r>
+        <w:rPr>
+          <w:b/>
+          <w:bCs/>
+          <w:sz w:val="28"/>
+          <w:szCs w:val="28"/>
+        </w:rPr>
+        <w:t>NSS Volunteer</w:t>
+      </w:r>
+    </w:p>
+    <w:p>
+      <w:pPr>
+        <w:rPr>
+          <w:sz w:val="28"/>
+          <w:szCs w:val="28"/>
+        </w:rPr>
+      </w:pPr>
+      <w:r>
+        <w:rPr>
+          <w:sz w:val="28"/>
+          <w:szCs w:val="28"/>
+        </w:rPr>
+        <w:t>Participated in community service activities.</w:t>
+      </w:r>
+    </w:p>
+    <w:p>
+      <w:pPr>
+        <w:rPr>
+          <w:sz w:val="28"/>
+          <w:szCs w:val="28"/>
+        </w:rPr>
+      </w:pPr>
+      <w:r>
+        <w:rPr>
+          <w:b/>
+          <w:bCs/>
+          <w:sz w:val="28"/>
+          <w:szCs w:val="28"/>
+        </w:rPr>
+        <w:t>3.</w:t>
+      </w:r>
+      <w:r>
+        <w:rPr>
+          <w:b/>
+          <w:bCs/>
+          <w:sz w:val="28"/>
+          <w:szCs w:val="28"/>
+        </w:rPr>
+        <w:t>Hackathon Participant</w:t>
+      </w:r>
+    </w:p>
+    <w:p>
+      <w:pPr>
+        <w:rPr>
+          <w:sz w:val="28"/>
+          <w:szCs w:val="28"/>
+        </w:rPr>
+      </w:pPr>
+      <w:r>
+        <w:rPr>
+          <w:sz w:val="28"/>
+          <w:szCs w:val="28"/>
+        </w:rPr>
+        <w:t>Built solutions in a team under time constraints.</w:t>
+      </w:r>
+    </w:p>
+    <w:p>
+      <w:pPr>
+        <w:rPr>
+          <w:sz w:val="28"/>
+          <w:szCs w:val="28"/>
+        </w:rPr>
+      </w:pPr>
+      <w:r>
+        <w:rPr>
+          <w:b/>
+          <w:bCs/>
+          <w:sz w:val="28"/>
+          <w:szCs w:val="28"/>
+        </w:rPr>
+        <w:t>4.</w:t>
+      </w:r>
+      <w:r>
+        <w:rPr>
+          <w:b/>
+          <w:bCs/>
+          <w:sz w:val="28"/>
+          <w:szCs w:val="28"/>
+        </w:rPr>
+        <w:t>Competitive Programming</w:t>
+      </w:r>
+    </w:p>
+    <w:p>
+      <w:pPr>
+        <w:rPr>
+          <w:sz w:val="28"/>
+          <w:szCs w:val="28"/>
+        </w:rPr>
+      </w:pPr>
+      <w:r>
+        <w:rPr>
+          <w:sz w:val="28"/>
+          <w:szCs w:val="28"/>
+        </w:rPr>
+        <w:t xml:space="preserve">Active on </w:t>
       </w:r>
       <w:proofErr w:type="spellStart"/>
       <w:r>
-        <w:t>glassmorphism</w:t>
+        <w:rPr>
+          <w:sz w:val="28"/>
+          <w:szCs w:val="28"/>
+        </w:rPr>
+        <w:t>HackerRank</w:t>
       </w:r>
       <w:proofErr w:type="spellEnd"/>
       <w:r>
-        <w:t xml:space="preserve"> design. </w:t>
-      </w:r>
-      <w:r>
-        <w:rPr>
-          <w:i/>
-          <w:iCs/>
-        </w:rPr>
-        <w:t>(HTML5, CSS3, JS)</w:t>
-      </w:r>
-    </w:p>
-    <w:p>
-      <w:r>
-        <w:pict w14:anchorId="27858A9D">
-          <v:rect id="_x0000_i1208" style="width:0;height:1.5pt" o:hralign="center" o:hrstd="t" o:hr="t" fillcolor="#a0a0a0" stroked="f"/>
-        </w:pict>
-      </w:r>
-    </w:p>
-    <w:p>
-      <w:pPr>
-        <w:rPr>
-          <w:b/>
-          <w:bCs/>
-        </w:rPr>
-      </w:pPr>
-      <w:r>
-        <w:rPr>
-          <w:b/>
-          <w:bCs/>
-        </w:rPr>
-        <w:t>Experience &amp; Achievements</w:t>
-      </w:r>
-    </w:p>
-    <w:p>
-      <w:pPr>
-        <w:numPr>
-          <w:ilvl w:val="0"/>
-          <w:numId w:val="11"/>
-        </w:numPr>
-      </w:pPr>
-      <w:r>
-        <w:rPr>
-          <w:b/>
-          <w:bCs/>
-        </w:rPr>
-        <w:t>Event Coordinator (STEPCONE):</w:t>
-      </w:r>
-      <w:r>
-        <w:t xml:space="preserve"> Managed logistics for national-level tech-fest ensuring smooth execution.</w:t>
-      </w:r>
-    </w:p>
-    <w:p>
-      <w:pPr>
-        <w:numPr>
-          <w:ilvl w:val="0"/>
-          <w:numId w:val="11"/>
-        </w:numPr>
-      </w:pPr>
-      <w:r>
-        <w:rPr>
-          <w:b/>
-          <w:bCs/>
-        </w:rPr>
-        <w:t>NSS Volunteer:</w:t>
-      </w:r>
-      <w:r>
-        <w:t xml:space="preserve"> Contributed to community service and welfare programs.</w:t>
-      </w:r>
-    </w:p>
-    <w:p>
-      <w:pPr>
-        <w:numPr>
-          <w:ilvl w:val="0"/>
-          <w:numId w:val="11"/>
-        </w:numPr>
-      </w:pPr>
-      <w:r>
-        <w:rPr>
-          <w:b/>
-          <w:bCs/>
-        </w:rPr>
-        <w:t>Hackathon Competitor:</w:t>
-      </w:r>
-      <w:r>
-        <w:t xml:space="preserve"> Built innovative solutions under pressure in team-based competitions.</w:t>
-      </w:r>
-    </w:p>
-    <w:p>
-      <w:pPr>
-        <w:numPr>
-          <w:ilvl w:val="0"/>
-          <w:numId w:val="11"/>
-        </w:numPr>
-      </w:pPr>
-      <w:r>
-        <w:rPr>
-          <w:b/>
-          <w:bCs/>
-        </w:rPr>
-        <w:t>Problem Solving Expert:</w:t>
-      </w:r>
-      <w:r>
-        <w:t xml:space="preserve"> Consistently ranked on platforms like </w:t>
+        <w:rPr>
+          <w:sz w:val="28"/>
+          <w:szCs w:val="28"/>
+        </w:rPr>
+        <w:t xml:space="preserve"> and </w:t>
       </w:r>
       <w:proofErr w:type="spellStart"/>
       <w:r>
-        <w:t>HackerRank</w:t>
+        <w:rPr>
+          <w:sz w:val="28"/>
+          <w:szCs w:val="28"/>
+        </w:rPr>
+        <w:t>CodeChef</w:t>
       </w:r>
       <w:proofErr w:type="spellEnd"/>
       <w:r>
-        <w:t xml:space="preserve"> &amp; </w:t>
-      </w:r>
-      <w:proofErr w:type="spellStart"/>
-      <w:r>
-        <w:t>CodeChef</w:t>
-      </w:r>
-      <w:proofErr w:type="spellEnd"/>
-      <w:r>
+        <w:rPr>
+          <w:sz w:val="28"/>
+          <w:szCs w:val="28"/>
+        </w:rPr>
         <w:t>.</w:t>
-      </w:r>
-    </w:p>
-    <w:p>
-      <w:r>
-        <w:pict w14:anchorId="49237E14">
-          <v:rect id="_x0000_i1209" style="width:0;height:1.5pt" o:hralign="center" o:hrstd="t" o:hr="t" fillcolor="#a0a0a0" stroked="f"/>
-        </w:pict>
-      </w:r>
-    </w:p>
-    <w:p>
-      <w:pPr>
-        <w:rPr>
-          <w:b/>
-          <w:bCs/>
-        </w:rPr>
-      </w:pPr>
-      <w:r>
-        <w:rPr>
-          <w:b/>
-          <w:bCs/>
-        </w:rPr>
-        <w:t>Services Offered</w:t>
-      </w:r>
-    </w:p>
-    <w:p>
-      <w:pPr>
-        <w:numPr>
-          <w:ilvl w:val="0"/>
-          <w:numId w:val="12"/>
-        </w:numPr>
-      </w:pPr>
-      <w:r>
-        <w:rPr>
-          <w:b/>
-          <w:bCs/>
-        </w:rPr>
-        <w:t>Cyber Security:</w:t>
-      </w:r>
-      <w:r>
-        <w:t xml:space="preserve"> Security audits, system hardening, awareness tooling.</w:t>
-      </w:r>
-    </w:p>
-    <w:p>
-      <w:pPr>
-        <w:numPr>
-          <w:ilvl w:val="0"/>
-          <w:numId w:val="12"/>
-        </w:numPr>
-      </w:pPr>
-      <w:r>
-        <w:rPr>
-          <w:b/>
-          <w:bCs/>
-        </w:rPr>
-        <w:t>Web Development:</w:t>
-      </w:r>
-      <w:r>
-        <w:t xml:space="preserve"> Clean, responsive websites and portfolios.</w:t>
-      </w:r>
-    </w:p>
-    <w:p>
-      <w:pPr>
-        <w:numPr>
-          <w:ilvl w:val="0"/>
-          <w:numId w:val="12"/>
-        </w:numPr>
-      </w:pPr>
-      <w:r>
-        <w:rPr>
-          <w:b/>
-          <w:bCs/>
-        </w:rPr>
-        <w:t>Automation:</w:t>
-      </w:r>
-      <w:r>
-        <w:t xml:space="preserve"> Python-based scripts and workflows for efficiency.</w:t>
-      </w:r>
-    </w:p>
-    <w:p>
-      <w:pPr>
-        <w:numPr>
-          <w:ilvl w:val="0"/>
-          <w:numId w:val="12"/>
-        </w:numPr>
-      </w:pPr>
-      <w:r>
-        <w:rPr>
-          <w:b/>
-          <w:bCs/>
-        </w:rPr>
-        <w:t>Software Setup:</w:t>
-      </w:r>
-      <w:r>
-        <w:t xml:space="preserve"> Development environment configuration and optimization.</w:t>
-      </w:r>
-    </w:p>
-    <w:p>
-      <w:r>
-        <w:pict w14:anchorId="71A8A552">
-          <v:rect id="_x0000_i1210" style="width:0;height:1.5pt" o:hralign="center" o:hrstd="t" o:hr="t" fillcolor="#a0a0a0" stroked="f"/>
-        </w:pict>
-      </w:r>
-    </w:p>
-    <w:p>
-      <w:pPr>
-        <w:rPr>
-          <w:b/>
-          <w:bCs/>
-        </w:rPr>
-      </w:pPr>
-      <w:r>
-        <w:rPr>
-          <w:b/>
-          <w:bCs/>
-        </w:rPr>
-        <w:t>Contact</w:t>
-      </w:r>
-    </w:p>
-    <w:p>
-      <w:r>
-        <w:rPr>
-          <w:rFonts w:ascii="Segoe UI Emoji" w:hAnsi="Segoe UI Emoji" w:cs="Segoe UI Emoji"/>
-        </w:rPr>
-        <w:t>📧</w:t>
-      </w:r>
-      <w:r>
-        <w:t xml:space="preserve"> Email: thrinadh2005@gmail.com</w:t>
-      </w:r>
-      <w:r>
-        <w:br/>
-      </w:r>
-      <w:r>
-        <w:rPr>
-          <w:rFonts w:ascii="Segoe UI Emoji" w:hAnsi="Segoe UI Emoji" w:cs="Segoe UI Emoji"/>
-        </w:rPr>
-        <w:t>📍</w:t>
-      </w:r>
-      <w:r>
-        <w:t xml:space="preserve"> Location: Rajahmundry, Andhra Pradesh</w:t>
       </w:r>
     </w:p>
     <w:p/>
     <w:sectPr>
-      <w:headerReference w:type="even" r:id="rId7"/>
-      <w:headerReference w:type="default" r:id="rId8"/>
-      <w:footerReference w:type="even" r:id="rId9"/>
-      <w:footerReference w:type="default" r:id="rId10"/>
-      <w:headerReference w:type="first" r:id="rId11"/>
-      <w:footerReference w:type="first" r:id="rId12"/>
+      <w:headerReference w:type="even" r:id="rId12"/>
+      <w:headerReference w:type="default" r:id="rId13"/>
+      <w:footerReference w:type="even" r:id="rId14"/>
+      <w:footerReference w:type="default" r:id="rId15"/>
+      <w:headerReference w:type="first" r:id="rId16"/>
+      <w:footerReference w:type="first" r:id="rId17"/>
       <w:pgSz w:w="11906" w:h="16838"/>
       <w:pgMar w:top="1440" w:right="1440" w:bottom="1440" w:left="1440" w:header="708" w:footer="708" w:gutter="0"/>
       <w:cols w:space="708"/>
@@ -1081,6 +2063,155 @@
     </w:lvl>
   </w:abstractNum>
   <w:abstractNum w:abstractNumId="1" w15:restartNumberingAfterBreak="0">
+    <w:nsid w:val="18B47741"/>
+    <w:multiLevelType w:val="multilevel"/>
+    <w:tmpl w:val="A2B8EA2A"/>
+    <w:lvl w:ilvl="0">
+      <w:start w:val="1"/>
+      <w:numFmt w:val="bullet"/>
+      <w:lvlText w:val=""/>
+      <w:lvlJc w:val="left"/>
+      <w:pPr>
+        <w:tabs>
+          <w:tab w:val="num" w:pos="720"/>
+        </w:tabs>
+        <w:ind w:left="720" w:hanging="360"/>
+      </w:pPr>
+      <w:rPr>
+        <w:rFonts w:ascii="Symbol" w:hAnsi="Symbol" w:hint="default"/>
+        <w:sz w:val="20"/>
+      </w:rPr>
+    </w:lvl>
+    <w:lvl w:ilvl="1">
+      <w:start w:val="1"/>
+      <w:numFmt w:val="bullet"/>
+      <w:lvlText w:val="o"/>
+      <w:lvlJc w:val="left"/>
+      <w:pPr>
+        <w:tabs>
+          <w:tab w:val="num" w:pos="1440"/>
+        </w:tabs>
+        <w:ind w:left="1440" w:hanging="360"/>
+      </w:pPr>
+      <w:rPr>
+        <w:rFonts w:ascii="Courier New" w:hAnsi="Courier New" w:hint="default"/>
+        <w:sz w:val="20"/>
+      </w:rPr>
+    </w:lvl>
+    <w:lvl w:ilvl="2" w:tentative="1">
+      <w:start w:val="1"/>
+      <w:numFmt w:val="bullet"/>
+      <w:lvlText w:val=""/>
+      <w:lvlJc w:val="left"/>
+      <w:pPr>
+        <w:tabs>
+          <w:tab w:val="num" w:pos="2160"/>
+        </w:tabs>
+        <w:ind w:left="2160" w:hanging="360"/>
+      </w:pPr>
+      <w:rPr>
+        <w:rFonts w:ascii="Wingdings" w:hAnsi="Wingdings" w:hint="default"/>
+        <w:sz w:val="20"/>
+      </w:rPr>
+    </w:lvl>
+    <w:lvl w:ilvl="3" w:tentative="1">
+      <w:start w:val="1"/>
+      <w:numFmt w:val="bullet"/>
+      <w:lvlText w:val=""/>
+      <w:lvlJc w:val="left"/>
+      <w:pPr>
+        <w:tabs>
+          <w:tab w:val="num" w:pos="2880"/>
+        </w:tabs>
+        <w:ind w:left="2880" w:hanging="360"/>
+      </w:pPr>
+      <w:rPr>
+        <w:rFonts w:ascii="Wingdings" w:hAnsi="Wingdings" w:hint="default"/>
+        <w:sz w:val="20"/>
+      </w:rPr>
+    </w:lvl>
+    <w:lvl w:ilvl="4" w:tentative="1">
+      <w:start w:val="1"/>
+      <w:numFmt w:val="bullet"/>
+      <w:lvlText w:val=""/>
+      <w:lvlJc w:val="left"/>
+      <w:pPr>
+        <w:tabs>
+          <w:tab w:val="num" w:pos="3600"/>
+        </w:tabs>
+        <w:ind w:left="3600" w:hanging="360"/>
+      </w:pPr>
+      <w:rPr>
+        <w:rFonts w:ascii="Wingdings" w:hAnsi="Wingdings" w:hint="default"/>
+        <w:sz w:val="20"/>
+      </w:rPr>
+    </w:lvl>
+    <w:lvl w:ilvl="5" w:tentative="1">
+      <w:start w:val="1"/>
+      <w:numFmt w:val="bullet"/>
+      <w:lvlText w:val=""/>
+      <w:lvlJc w:val="left"/>
+      <w:pPr>
+        <w:tabs>
+          <w:tab w:val="num" w:pos="4320"/>
+        </w:tabs>
+        <w:ind w:left="4320" w:hanging="360"/>
+      </w:pPr>
+      <w:rPr>
+        <w:rFonts w:ascii="Wingdings" w:hAnsi="Wingdings" w:hint="default"/>
+        <w:sz w:val="20"/>
+      </w:rPr>
+    </w:lvl>
+    <w:lvl w:ilvl="6" w:tentative="1">
+      <w:start w:val="1"/>
+      <w:numFmt w:val="bullet"/>
+      <w:lvlText w:val=""/>
+      <w:lvlJc w:val="left"/>
+      <w:pPr>
+        <w:tabs>
+          <w:tab w:val="num" w:pos="5040"/>
+        </w:tabs>
+        <w:ind w:left="5040" w:hanging="360"/>
+      </w:pPr>
+      <w:rPr>
+        <w:rFonts w:ascii="Wingdings" w:hAnsi="Wingdings" w:hint="default"/>
+        <w:sz w:val="20"/>
+      </w:rPr>
+    </w:lvl>
+    <w:lvl w:ilvl="7" w:tentative="1">
+      <w:start w:val="1"/>
+      <w:numFmt w:val="bullet"/>
+      <w:lvlText w:val=""/>
+      <w:lvlJc w:val="left"/>
+      <w:pPr>
+        <w:tabs>
+          <w:tab w:val="num" w:pos="5760"/>
+        </w:tabs>
+        <w:ind w:left="5760" w:hanging="360"/>
+      </w:pPr>
+      <w:rPr>
+        <w:rFonts w:ascii="Wingdings" w:hAnsi="Wingdings" w:hint="default"/>
+        <w:sz w:val="20"/>
+      </w:rPr>
+    </w:lvl>
+    <w:lvl w:ilvl="8" w:tentative="1">
+      <w:start w:val="1"/>
+      <w:numFmt w:val="bullet"/>
+      <w:lvlText w:val=""/>
+      <w:lvlJc w:val="left"/>
+      <w:pPr>
+        <w:tabs>
+          <w:tab w:val="num" w:pos="6480"/>
+        </w:tabs>
+        <w:ind w:left="6480" w:hanging="360"/>
+      </w:pPr>
+      <w:rPr>
+        <w:rFonts w:ascii="Wingdings" w:hAnsi="Wingdings" w:hint="default"/>
+        <w:sz w:val="20"/>
+      </w:rPr>
+    </w:lvl>
+  </w:abstractNum>
+  <w:abstractNum w:abstractNumId="2" w15:restartNumberingAfterBreak="0">
     <w:nsid w:val="20B87C6E"/>
     <w:multiLevelType w:val="multilevel"/>
     <w:tmpl w:val="DC72A680"/>
@@ -1229,7 +2360,7 @@
       </w:rPr>
     </w:lvl>
   </w:abstractNum>
-  <w:abstractNum w:abstractNumId="2" w15:restartNumberingAfterBreak="0">
+  <w:abstractNum w:abstractNumId="3" w15:restartNumberingAfterBreak="0">
     <w:nsid w:val="22D57DBC"/>
     <w:multiLevelType w:val="multilevel"/>
     <w:tmpl w:val="B89A7F84"/>
@@ -1378,7 +2509,7 @@
       </w:rPr>
     </w:lvl>
   </w:abstractNum>
-  <w:abstractNum w:abstractNumId="3" w15:restartNumberingAfterBreak="0">
+  <w:abstractNum w:abstractNumId="4" w15:restartNumberingAfterBreak="0">
     <w:nsid w:val="25F268A2"/>
     <w:multiLevelType w:val="multilevel"/>
     <w:tmpl w:val="A59270B4"/>
@@ -1527,7 +2658,153 @@
       </w:rPr>
     </w:lvl>
   </w:abstractNum>
-  <w:abstractNum w:abstractNumId="4" w15:restartNumberingAfterBreak="0">
+  <w:abstractNum w:abstractNumId="5" w15:restartNumberingAfterBreak="0">
+    <w:nsid w:val="2E1052D9"/>
+    <w:multiLevelType w:val="multilevel"/>
+    <w:tmpl w:val="E76A8CF8"/>
+    <w:lvl w:ilvl="0">
+      <w:start w:val="1"/>
+      <w:numFmt w:val="bullet"/>
+      <w:lvlText w:val=""/>
+      <w:lvlJc w:val="left"/>
+      <w:pPr>
+        <w:tabs>
+          <w:tab w:val="num" w:pos="720"/>
+        </w:tabs>
+        <w:ind w:left="720" w:hanging="360"/>
+      </w:pPr>
+      <w:rPr>
+        <w:rFonts w:ascii="Symbol" w:hAnsi="Symbol" w:hint="default"/>
+        <w:sz w:val="20"/>
+      </w:rPr>
+    </w:lvl>
+    <w:lvl w:ilvl="1">
+      <w:start w:val="2"/>
+      <w:numFmt w:val="decimal"/>
+      <w:lvlText w:val="%2."/>
+      <w:lvlJc w:val="left"/>
+      <w:pPr>
+        <w:ind w:left="1440" w:hanging="360"/>
+      </w:pPr>
+      <w:rPr>
+        <w:rFonts w:hint="default"/>
+        <w:b/>
+      </w:rPr>
+    </w:lvl>
+    <w:lvl w:ilvl="2" w:tentative="1">
+      <w:start w:val="1"/>
+      <w:numFmt w:val="bullet"/>
+      <w:lvlText w:val=""/>
+      <w:lvlJc w:val="left"/>
+      <w:pPr>
+        <w:tabs>
+          <w:tab w:val="num" w:pos="2160"/>
+        </w:tabs>
+        <w:ind w:left="2160" w:hanging="360"/>
+      </w:pPr>
+      <w:rPr>
+        <w:rFonts w:ascii="Wingdings" w:hAnsi="Wingdings" w:hint="default"/>
+        <w:sz w:val="20"/>
+      </w:rPr>
+    </w:lvl>
+    <w:lvl w:ilvl="3" w:tentative="1">
+      <w:start w:val="1"/>
+      <w:numFmt w:val="bullet"/>
+      <w:lvlText w:val=""/>
+      <w:lvlJc w:val="left"/>
+      <w:pPr>
+        <w:tabs>
+          <w:tab w:val="num" w:pos="2880"/>
+        </w:tabs>
+        <w:ind w:left="2880" w:hanging="360"/>
+      </w:pPr>
+      <w:rPr>
+        <w:rFonts w:ascii="Wingdings" w:hAnsi="Wingdings" w:hint="default"/>
+        <w:sz w:val="20"/>
+      </w:rPr>
+    </w:lvl>
+    <w:lvl w:ilvl="4" w:tentative="1">
+      <w:start w:val="1"/>
+      <w:numFmt w:val="bullet"/>
+      <w:lvlText w:val=""/>
+      <w:lvlJc w:val="left"/>
+      <w:pPr>
+        <w:tabs>
+          <w:tab w:val="num" w:pos="3600"/>
+        </w:tabs>
+        <w:ind w:left="3600" w:hanging="360"/>
+      </w:pPr>
+      <w:rPr>
+        <w:rFonts w:ascii="Wingdings" w:hAnsi="Wingdings" w:hint="default"/>
+        <w:sz w:val="20"/>
+      </w:rPr>
+    </w:lvl>
+    <w:lvl w:ilvl="5" w:tentative="1">
+      <w:start w:val="1"/>
+      <w:numFmt w:val="bullet"/>
+      <w:lvlText w:val=""/>
+      <w:lvlJc w:val="left"/>
+      <w:pPr>
+        <w:tabs>
+          <w:tab w:val="num" w:pos="4320"/>
+        </w:tabs>
+        <w:ind w:left="4320" w:hanging="360"/>
+      </w:pPr>
+      <w:rPr>
+        <w:rFonts w:ascii="Wingdings" w:hAnsi="Wingdings" w:hint="default"/>
+        <w:sz w:val="20"/>
+      </w:rPr>
+    </w:lvl>
+    <w:lvl w:ilvl="6" w:tentative="1">
+      <w:start w:val="1"/>
+      <w:numFmt w:val="bullet"/>
+      <w:lvlText w:val=""/>
+      <w:lvlJc w:val="left"/>
+      <w:pPr>
+        <w:tabs>
+          <w:tab w:val="num" w:pos="5040"/>
+        </w:tabs>
+        <w:ind w:left="5040" w:hanging="360"/>
+      </w:pPr>
+      <w:rPr>
+        <w:rFonts w:ascii="Wingdings" w:hAnsi="Wingdings" w:hint="default"/>
+        <w:sz w:val="20"/>
+      </w:rPr>
+    </w:lvl>
+    <w:lvl w:ilvl="7" w:tentative="1">
+      <w:start w:val="1"/>
+      <w:numFmt w:val="bullet"/>
+      <w:lvlText w:val=""/>
+      <w:lvlJc w:val="left"/>
+      <w:pPr>
+        <w:tabs>
+          <w:tab w:val="num" w:pos="5760"/>
+        </w:tabs>
+        <w:ind w:left="5760" w:hanging="360"/>
+      </w:pPr>
+      <w:rPr>
+        <w:rFonts w:ascii="Wingdings" w:hAnsi="Wingdings" w:hint="default"/>
+        <w:sz w:val="20"/>
+      </w:rPr>
+    </w:lvl>
+    <w:lvl w:ilvl="8" w:tentative="1">
+      <w:start w:val="1"/>
+      <w:numFmt w:val="bullet"/>
+      <w:lvlText w:val=""/>
+      <w:lvlJc w:val="left"/>
+      <w:pPr>
+        <w:tabs>
+          <w:tab w:val="num" w:pos="6480"/>
+        </w:tabs>
+        <w:ind w:left="6480" w:hanging="360"/>
+      </w:pPr>
+      <w:rPr>
+        <w:rFonts w:ascii="Wingdings" w:hAnsi="Wingdings" w:hint="default"/>
+        <w:sz w:val="20"/>
+      </w:rPr>
+    </w:lvl>
+  </w:abstractNum>
+  <w:abstractNum w:abstractNumId="6" w15:restartNumberingAfterBreak="0">
     <w:nsid w:val="31D73198"/>
     <w:multiLevelType w:val="multilevel"/>
     <w:tmpl w:val="8EEC5E1A"/>
@@ -1676,7 +2953,7 @@
       </w:rPr>
     </w:lvl>
   </w:abstractNum>
-  <w:abstractNum w:abstractNumId="5" w15:restartNumberingAfterBreak="0">
+  <w:abstractNum w:abstractNumId="7" w15:restartNumberingAfterBreak="0">
     <w:nsid w:val="3AF74B64"/>
     <w:multiLevelType w:val="multilevel"/>
     <w:tmpl w:val="E15E6540"/>
@@ -1825,7 +3102,7 @@
       </w:rPr>
     </w:lvl>
   </w:abstractNum>
-  <w:abstractNum w:abstractNumId="6" w15:restartNumberingAfterBreak="0">
+  <w:abstractNum w:abstractNumId="8" w15:restartNumberingAfterBreak="0">
     <w:nsid w:val="47CB756C"/>
     <w:multiLevelType w:val="multilevel"/>
     <w:tmpl w:val="23409736"/>
@@ -1974,7 +3251,7 @@
       </w:rPr>
     </w:lvl>
   </w:abstractNum>
-  <w:abstractNum w:abstractNumId="7" w15:restartNumberingAfterBreak="0">
+  <w:abstractNum w:abstractNumId="9" w15:restartNumberingAfterBreak="0">
     <w:nsid w:val="5552602D"/>
     <w:multiLevelType w:val="multilevel"/>
     <w:tmpl w:val="F7B6A768"/>
@@ -2123,7 +3400,7 @@
       </w:rPr>
     </w:lvl>
   </w:abstractNum>
-  <w:abstractNum w:abstractNumId="8" w15:restartNumberingAfterBreak="0">
+  <w:abstractNum w:abstractNumId="10" w15:restartNumberingAfterBreak="0">
     <w:nsid w:val="60C12700"/>
     <w:multiLevelType w:val="multilevel"/>
     <w:tmpl w:val="A6F22B3E"/>
@@ -2272,7 +3549,7 @@
       </w:rPr>
     </w:lvl>
   </w:abstractNum>
-  <w:abstractNum w:abstractNumId="9" w15:restartNumberingAfterBreak="0">
+  <w:abstractNum w:abstractNumId="11" w15:restartNumberingAfterBreak="0">
     <w:nsid w:val="6B0909A7"/>
     <w:multiLevelType w:val="multilevel"/>
     <w:tmpl w:val="F1C0ECBC"/>
@@ -2421,7 +3698,7 @@
       </w:rPr>
     </w:lvl>
   </w:abstractNum>
-  <w:abstractNum w:abstractNumId="10" w15:restartNumberingAfterBreak="0">
+  <w:abstractNum w:abstractNumId="12" w15:restartNumberingAfterBreak="0">
     <w:nsid w:val="6D60408B"/>
     <w:multiLevelType w:val="multilevel"/>
     <w:tmpl w:val="CAE41DC4"/>
@@ -2570,7 +3847,7 @@
       </w:rPr>
     </w:lvl>
   </w:abstractNum>
-  <w:abstractNum w:abstractNumId="11" w15:restartNumberingAfterBreak="0">
+  <w:abstractNum w:abstractNumId="13" w15:restartNumberingAfterBreak="0">
     <w:nsid w:val="76F03597"/>
     <w:multiLevelType w:val="multilevel"/>
     <w:tmpl w:val="357AFEB0"/>
@@ -2720,40 +3997,46 @@
     </w:lvl>
   </w:abstractNum>
   <w:num w:numId="1" w16cid:durableId="1108089631">
+    <w:abstractNumId w:val="8"/>
+  </w:num>
+  <w:num w:numId="2" w16cid:durableId="1176069594">
     <w:abstractNumId w:val="6"/>
   </w:num>
-  <w:num w:numId="2" w16cid:durableId="1176069594">
-    <w:abstractNumId w:val="4"/>
-  </w:num>
   <w:num w:numId="3" w16cid:durableId="1423991527">
-    <w:abstractNumId w:val="5"/>
+    <w:abstractNumId w:val="7"/>
   </w:num>
   <w:num w:numId="4" w16cid:durableId="833109680">
-    <w:abstractNumId w:val="11"/>
+    <w:abstractNumId w:val="13"/>
   </w:num>
   <w:num w:numId="5" w16cid:durableId="1072970652">
+    <w:abstractNumId w:val="3"/>
+  </w:num>
+  <w:num w:numId="6" w16cid:durableId="269699600">
     <w:abstractNumId w:val="2"/>
   </w:num>
-  <w:num w:numId="6" w16cid:durableId="269699600">
-    <w:abstractNumId w:val="1"/>
-  </w:num>
   <w:num w:numId="7" w16cid:durableId="899637630">
-    <w:abstractNumId w:val="8"/>
+    <w:abstractNumId w:val="10"/>
   </w:num>
   <w:num w:numId="8" w16cid:durableId="599215732">
-    <w:abstractNumId w:val="10"/>
+    <w:abstractNumId w:val="12"/>
   </w:num>
   <w:num w:numId="9" w16cid:durableId="104617141">
     <w:abstractNumId w:val="0"/>
   </w:num>
   <w:num w:numId="10" w16cid:durableId="1181435845">
+    <w:abstractNumId w:val="11"/>
+  </w:num>
+  <w:num w:numId="11" w16cid:durableId="286352199">
+    <w:abstractNumId w:val="4"/>
+  </w:num>
+  <w:num w:numId="12" w16cid:durableId="1547985331">
     <w:abstractNumId w:val="9"/>
   </w:num>
-  <w:num w:numId="11" w16cid:durableId="286352199">
-    <w:abstractNumId w:val="3"/>
+  <w:num w:numId="13" w16cid:durableId="564296779">
+    <w:abstractNumId w:val="5"/>
   </w:num>
-  <w:num w:numId="12" w16cid:durableId="1547985331">
-    <w:abstractNumId w:val="7"/>
+  <w:num w:numId="14" w16cid:durableId="1916746043">
+    <w:abstractNumId w:val="1"/>
   </w:num>
 </w:numbering>
 </file>
@@ -3156,10 +4439,12 @@
   <w:style w:type="paragraph" w:default="1" w:styleId="Normal">
     <w:name w:val="Normal"/>
     <w:qFormat/>
+    <w:rsid w:val="00F53E53"/>
   </w:style>
   <w:style w:type="character" w:default="1" w:styleId="DefaultParagraphFont">
     <w:name w:val="Default Paragraph Font"/>
     <w:uiPriority w:val="1"/>
+    <w:semiHidden/>
     <w:unhideWhenUsed/>
   </w:style>
   <w:style w:type="table" w:default="1" w:styleId="TableNormal">
@@ -3226,6 +4511,26 @@
     <w:link w:val="Footer"/>
     <w:uiPriority w:val="99"/>
     <w:rsid w:val="00680AE1"/>
+  </w:style>
+  <w:style w:type="character" w:styleId="Hyperlink">
+    <w:name w:val="Hyperlink"/>
+    <w:basedOn w:val="DefaultParagraphFont"/>
+    <w:uiPriority w:val="99"/>
+    <w:unhideWhenUsed/>
+    <w:rsid w:val="00F53E53"/>
+    <w:rPr>
+      <w:color w:val="0563C1" w:themeColor="hyperlink"/>
+      <w:u w:val="single"/>
+    </w:rPr>
+  </w:style>
+  <w:style w:type="paragraph" w:styleId="NoSpacing">
+    <w:name w:val="No Spacing"/>
+    <w:uiPriority w:val="1"/>
+    <w:qFormat/>
+    <w:rsid w:val="00F53E53"/>
+    <w:pPr>
+      <w:spacing w:after="0" w:line="240" w:lineRule="auto"/>
+    </w:pPr>
   </w:style>
 </w:styles>
 </file>

</xml_diff>